<commit_message>
EngageWell: concrete fundraising bullets, harm-reduction framing in letter; master list fundraising evidence
Co-Authored-By: Claude Opus 5.5 <noreply@anthropic.com>
Claude-Session: https://claude.ai/code/session_01Rb4ZTXZXZvRymPmEXq9dPj
</commit_message>
<xml_diff>
--- a/resumes/Clavel_Lazarre_Cover_Letter_EngageWell.docx
+++ b/resumes/Clavel_Lazarre_Cover_Letter_EngageWell.docx
@@ -89,7 +89,7 @@
           <w:color w:val="222222"/>
           <w:sz w:val="22"/>
         </w:rPr>
-        <w:t>Revenue diversification has been central to my work. At the Osborne Association, I structured and negotiated more than $10M in new government, institutional, and corporate contracts and raised over $400K from private donors, foundations, and corporate partners, including REDF and JC Flowers. I also built pricing, monetization plans, and budgets for earned-revenue social ventures, and I helped move a 140-person division from a deficit exceeding $1M to a 13% operating surplus within one year while partnering with the CEO and the Board’s Finance and Audit Committees.</w:t>
+        <w:t>Revenue diversification has been central to my work. At the Osborne Association, I structured and negotiated more than $10M in new government, institutional, and corporate contracts and raised over $400K from private donors, foundations, and corporate partners, including REDF and JC Flowers, by identifying prospects, developing proposals, personally leading solicitations, and stewarding those relationships with the CEO and Board. I also built pricing, monetization plans, and budgets for earned-revenue social ventures, and I helped move a 140-person division from a deficit exceeding $1M to a 13% operating surplus within one year while partnering with the CEO and the Board’s Finance and Audit Committees.</w:t>
       </w:r>
     </w:p>
     <w:p>
@@ -106,7 +106,7 @@
           <w:color w:val="222222"/>
           <w:sz w:val="22"/>
         </w:rPr>
-        <w:t>I also bring hands-on healthcare financing experience. As a fractional CFO, I manage the finances of a physician practice that participates in an IPA, including its IPA-related reporting and billing to Medicaid managed care and other insurance plans. Earlier in my career, I advised Medicare and Medicaid beneficiaries on plan benefits and enrollment. At Osborne, I partnered with the Director of El Rio, a substance use treatment program for people returning from incarceration, on budgeting, hiring, and participant placements.</w:t>
+        <w:t>I also bring hands-on healthcare financing experience. As a fractional CFO, I manage the finances of a physician practice that participates in an IPA, including its IPA-related reporting and billing to Medicaid managed care and other insurance plans. Earlier in my career, I advised Medicare and Medicaid beneficiaries on plan benefits and enrollment. At Osborne, I partnered with the Director of El Rio, a substance use treatment program for people returning from incarceration, on budgeting, hiring, and participant placements. That work taught me that people engage with care when they are met where they are, treated with dignity, and trusted to make their own choices. Nonjudgmental, low-barrier access is not only a value; it is how programs earn the trust that keeps people connected to services.</w:t>
       </w:r>
     </w:p>
     <w:p>

</xml_diff>